<commit_message>
update discovery report to use regional nat
</commit_message>
<xml_diff>
--- a/labs/week2/docs/discovery.docx
+++ b/labs/week2/docs/discovery.docx
@@ -664,7 +664,7 @@
           </w:tcPr>
           <w:p>
             <w:r>
-              <w:t xml:space="preserve">3. Multi-AZ public and private subnets with a load balancer, NAT gateways and Session Manager</w:t>
+              <w:t xml:space="preserve">3. Multi-AZ public and private subnets with a load balancer, a regional NAT gateway and Session Manager</w:t>
             </w:r>
           </w:p>
         </w:tc>
@@ -686,7 +686,7 @@
           </w:tcPr>
           <w:p>
             <w:r>
-              <w:t xml:space="preserve">A load balancer in two Availability Zones is the only thing on the internet. Web and order servers live in private subnets. NAT gateways let them make outbound connections for updates. Engineers open a shell through AWS Systems Manager Session Manager, which uses an outbound connection the server makes to AWS, so no inbound port is opened.</w:t>
+              <w:t xml:space="preserve">A load balancer in two Availability Zones is the only thing on the internet. Web and order servers live in private subnets. A regional NAT gateway lets them make outbound connections for updates. Engineers open a shell through AWS Systems Manager Session Manager, which uses an outbound connection the server makes to AWS, so no inbound port is opened.</w:t>
             </w:r>
           </w:p>
         </w:tc>
@@ -725,7 +725,7 @@
               <w:t xml:space="preserve">Weakness:</w:t>
             </w:r>
             <w:r>
-              <w:t xml:space="preserve"> the load balancer and NAT gateways bill by the hour even when traffic is quiet, so it costs more than a single server.</w:t>
+              <w:t xml:space="preserve"> the load balancer and NAT gateway bill by the hour even when traffic is quiet, so it costs more than a single server.</w:t>
             </w:r>
           </w:p>
         </w:tc>
@@ -965,9 +965,30 @@
         <w:spacing w:after="80"/>
       </w:pPr>
       <w:r>
+        <w:t xml:space="preserve">AWS, </w:t>
+      </w:r>
+      <w:hyperlink r:id="rIdLink8" w:history="1">
+        <w:r>
+          <w:rPr>
+            <w:rStyle w:val="Hyperlink"/>
+          </w:rPr>
+          <w:t xml:space="preserve">Regional NAT gateways for automatic multi-AZ expansion</w:t>
+        </w:r>
+      </w:hyperlink>
+    </w:p>
+    <w:p>
+      <w:pPr>
+        <w:pStyle w:val="ListParagraph"/>
+        <w:numPr>
+          <w:ilvl w:val="0"/>
+          <w:numId w:val="2"/>
+        </w:numPr>
+        <w:spacing w:after="80"/>
+      </w:pPr>
+      <w:r>
         <w:t xml:space="preserve">AWS pricing: </w:t>
       </w:r>
-      <w:hyperlink r:id="rIdLink8" w:history="1">
+      <w:hyperlink r:id="rIdLink9" w:history="1">
         <w:r>
           <w:rPr>
             <w:rStyle w:val="Hyperlink"/>
@@ -978,7 +999,7 @@
       <w:r>
         <w:t xml:space="preserve">, </w:t>
       </w:r>
-      <w:hyperlink r:id="rIdLink9" w:history="1">
+      <w:hyperlink r:id="rIdLink10" w:history="1">
         <w:r>
           <w:rPr>
             <w:rStyle w:val="Hyperlink"/>
@@ -989,7 +1010,7 @@
       <w:r>
         <w:t xml:space="preserve">, </w:t>
       </w:r>
-      <w:hyperlink r:id="rIdLink10" w:history="1">
+      <w:hyperlink r:id="rIdLink11" w:history="1">
         <w:r>
           <w:rPr>
             <w:rStyle w:val="Hyperlink"/>
@@ -1051,17 +1072,17 @@
         <w:t xml:space="preserve">private subnets</w:t>
       </w:r>
       <w:r>
-        <w:t xml:space="preserve">, each Availability Zone has its own </w:t>
+        <w:t xml:space="preserve">, a single </w:t>
       </w:r>
       <w:r>
         <w:rPr>
           <w:b/>
           <w:bCs/>
         </w:rPr>
-        <w:t xml:space="preserve">NAT gateway</w:t>
-      </w:r>
-      <w:r>
-        <w:t xml:space="preserve"> for outbound updates, and engineers administer servers through </w:t>
+        <w:t xml:space="preserve">regional NAT gateway</w:t>
+      </w:r>
+      <w:r>
+        <w:t xml:space="preserve"> serves both zones for outbound updates, and engineers administer servers through </w:t>
       </w:r>
       <w:r>
         <w:rPr>
@@ -1087,17 +1108,17 @@
         <w:spacing w:after="200"/>
       </w:pPr>
       <w:r>
-        <w:t xml:space="preserve">I chose </w:t>
+        <w:t xml:space="preserve">I chose a </w:t>
       </w:r>
       <w:r>
         <w:rPr>
           <w:b/>
           <w:bCs/>
         </w:rPr>
-        <w:t xml:space="preserve">one NAT gateway per Availability Zone</w:t>
-      </w:r>
-      <w:r>
-        <w:t xml:space="preserve"> rather than one shared gateway. With a single gateway, losing its zone would cut off updates for the servers in the healthy zone too, and replacement servers launched there could not finish installing. Onward ranks staying up on peak days above cost, so the second gateway is worth paying for.</w:t>
+        <w:t xml:space="preserve">regional NAT gateway</w:t>
+      </w:r>
+      <w:r>
+        <w:t xml:space="preserve"> rather than a standard (zonal) NAT gateway. A zonal gateway lives in one Availability Zone, so one shared gateway would cut off updates in both zones if its zone failed, and the usual fix is one gateway per zone, each in its own public subnet with its own route table. A regional gateway gives the same resilience as one gateway per zone: it runs in every zone that has servers and follows them automatically. It needs no public subnet, and every private subnet uses one route table with a single route. That means fewer parts to misconfigure for a small platform team, at about the same cost.</w:t>
       </w:r>
     </w:p>
     <w:p>
@@ -1640,7 +1661,7 @@
           </w:tcPr>
           <w:p>
             <w:r>
-              <w:t xml:space="preserve">NAT gateway (one per zone)</w:t>
+              <w:t xml:space="preserve">Regional NAT gateway</w:t>
             </w:r>
           </w:p>
         </w:tc>
@@ -1684,7 +1705,7 @@
           </w:tcPr>
           <w:p>
             <w:r>
-              <w:t xml:space="preserve">Meets the Head of Operations' need for updates without giving internal servers a public address. One per zone, so a zone failure doesn't cut off the other zone.</w:t>
+              <w:t xml:space="preserve">Meets the Head of Operations' need for updates without giving internal servers a public address. It runs in each zone that has servers, so a zone failure doesn't cut off the other zone. It needs no public subnet of its own and only one private route table, so there is less to get wrong.</w:t>
             </w:r>
           </w:p>
         </w:tc>
@@ -2089,7 +2110,7 @@
           </w:tcPr>
           <w:p>
             <w:r>
-              <w:t xml:space="preserve">NAT gateways (2)</w:t>
+              <w:t xml:space="preserve">Regional NAT gateway (active in 2 zones)</w:t>
             </w:r>
           </w:p>
         </w:tc>
@@ -2111,7 +2132,7 @@
           </w:tcPr>
           <w:p>
             <w:r>
-              <w:t xml:space="preserve">USD 0.048 per hour each, plus USD 0.048 per GB processed</w:t>
+              <w:t xml:space="preserve">USD 0.048 per zone per hour, plus USD 0.048 per GB processed</w:t>
             </w:r>
           </w:p>
         </w:tc>
@@ -2166,7 +2187,7 @@
           </w:tcPr>
           <w:p>
             <w:r>
-              <w:t xml:space="preserve">Public IPv4 addresses (NAT gateways and load balancer)</w:t>
+              <w:t xml:space="preserve">Public IPv4 addresses (NAT gateway, one per zone, and load balancer)</w:t>
             </w:r>
           </w:p>
         </w:tc>
@@ -2303,7 +2324,7 @@
         <w:spacing w:after="120"/>
       </w:pPr>
       <w:r>
-        <w:t xml:space="preserve">The NAT gateways are the largest cost, so I compared the alternatives and rejected them:</w:t>
+        <w:t xml:space="preserve">The NAT gateway is the largest cost, so I compared the alternatives and rejected them:</w:t>
       </w:r>
     </w:p>
     <w:p>
@@ -2320,7 +2341,7 @@
           <w:b/>
           <w:bCs/>
         </w:rPr>
-        <w:t xml:space="preserve">One shared NAT gateway</w:t>
+        <w:t xml:space="preserve">One shared zonal NAT gateway</w:t>
       </w:r>
       <w:r>
         <w:t xml:space="preserve"> would save about USD 35 a month, but a failure in its zone would cut off updates in both zones. Rejected, because staying up on peak days is Onward's first priority.</w:t>
@@ -2340,10 +2361,30 @@
           <w:b/>
           <w:bCs/>
         </w:rPr>
+        <w:t xml:space="preserve">One zonal NAT gateway per zone</w:t>
+      </w:r>
+      <w:r>
+        <w:t xml:space="preserve"> gives the same resilience at the same cost, but needs a NAT gateway in each public subnet, a separate private route table per zone, and manual changes whenever Onward adds a zone. Rejected because the regional gateway does the same job with fewer parts.</w:t>
+      </w:r>
+    </w:p>
+    <w:p>
+      <w:pPr>
+        <w:pStyle w:val="ListParagraph"/>
+        <w:numPr>
+          <w:ilvl w:val="0"/>
+          <w:numId w:val="2"/>
+        </w:numPr>
+        <w:spacing w:after="80"/>
+      </w:pPr>
+      <w:r>
+        <w:rPr>
+          <w:b/>
+          <w:bCs/>
+        </w:rPr>
         <w:t xml:space="preserve">VPC interface endpoints for Systems Manager</w:t>
       </w:r>
       <w:r>
-        <w:t xml:space="preserve"> cost about USD 0.011 per hour per endpoint per zone. Session Manager needs three, which is about USD 16 a month for two zones. They would not remove the NAT gateways, because servers still need to download packages from the internet. Rejected as an extra cost for now, but they are the right next step if Onward later wants internal servers with no internet path at all.</w:t>
+        <w:t xml:space="preserve"> cost about USD 0.011 per hour per endpoint per zone. Session Manager needs three, which is about USD 16 a month for two zones. They would not remove the NAT gateway, because servers still need to download packages from the internet. Rejected as an extra cost for now, but they are the right next step if Onward later wants internal servers with no internet path at all.</w:t>
       </w:r>
     </w:p>
     <w:p>
@@ -2901,7 +2942,27 @@
         <w:t xml:space="preserve">Outbound traffic is open.</w:t>
       </w:r>
       <w:r>
-        <w:t xml:space="preserve"> Private servers can reach any internet address through the NAT gateways. A stricter design would limit outbound traffic to known package repositories.</w:t>
+        <w:t xml:space="preserve"> Private servers can reach any internet address through the NAT gateway. A stricter design would limit outbound traffic to known package repositories.</w:t>
+      </w:r>
+    </w:p>
+    <w:p>
+      <w:pPr>
+        <w:pStyle w:val="ListParagraph"/>
+        <w:numPr>
+          <w:ilvl w:val="0"/>
+          <w:numId w:val="2"/>
+        </w:numPr>
+        <w:spacing w:after="80"/>
+      </w:pPr>
+      <w:r>
+        <w:rPr>
+          <w:b/>
+          <w:bCs/>
+        </w:rPr>
+        <w:t xml:space="preserve">The NAT gateway takes time to reach a new zone.</w:t>
+      </w:r>
+      <w:r>
+        <w:t xml:space="preserve"> A regional NAT gateway can take up to 60 minutes to start running in a zone where servers have just appeared. Until then, that zone's outbound traffic is handled from the other zone, so it still works, but it is not isolated from that zone failing. Regional NAT gateways are also a newer AWS feature (2025) and do not support private NAT.</w:t>
       </w:r>
     </w:p>
     <w:p>

</xml_diff>

<commit_message>
docs: update discovery report
</commit_message>
<xml_diff>
--- a/labs/week2/docs/discovery.docx
+++ b/labs/week2/docs/discovery.docx
@@ -664,7 +664,7 @@
           </w:tcPr>
           <w:p>
             <w:r>
-              <w:t xml:space="preserve">3. Multi-AZ public and private subnets with a load balancer, a regional NAT gateway and Session Manager</w:t>
+              <w:t xml:space="preserve">3. Multi-AZ layered network: load balancers, private subnets, a regional NAT gateway and Session Manager</w:t>
             </w:r>
           </w:p>
         </w:tc>
@@ -686,7 +686,7 @@
           </w:tcPr>
           <w:p>
             <w:r>
-              <w:t xml:space="preserve">A load balancer in two Availability Zones is the only thing on the internet. Web and order servers live in private subnets. A regional NAT gateway lets them make outbound connections for updates. Engineers open a shell through AWS Systems Manager Session Manager, which uses an outbound connection the server makes to AWS, so no inbound port is opened.</w:t>
+              <w:t xml:space="preserve">A load balancer in two Availability Zones is the only thing on the internet. Web and order servers live in private subnets, and the web servers reach the order servers through an internal load balancer. A regional NAT gateway lets them make outbound connections for updates. Engineers open a shell through AWS Systems Manager Session Manager, which uses an outbound connection the server makes to AWS, so no inbound port is opened.</w:t>
             </w:r>
           </w:p>
         </w:tc>
@@ -725,7 +725,7 @@
               <w:t xml:space="preserve">Weakness:</w:t>
             </w:r>
             <w:r>
-              <w:t xml:space="preserve"> the load balancer and NAT gateway bill by the hour even when traffic is quiet, so it costs more than a single server.</w:t>
+              <w:t xml:space="preserve"> the load balancers and NAT gateway bill by the hour even when traffic is quiet, so it costs more than a single server.</w:t>
             </w:r>
           </w:p>
         </w:tc>
@@ -986,9 +986,20 @@
         <w:spacing w:after="80"/>
       </w:pPr>
       <w:r>
-        <w:t xml:space="preserve">AWS pricing: </w:t>
+        <w:t xml:space="preserve">AWS, </w:t>
       </w:r>
       <w:hyperlink r:id="rIdLink9" w:history="1">
+        <w:r>
+          <w:rPr>
+            <w:rStyle w:val="Hyperlink"/>
+          </w:rPr>
+          <w:t xml:space="preserve">Price List for Amazon EC2 in eu-west-1</w:t>
+        </w:r>
+      </w:hyperlink>
+      <w:r>
+        <w:t xml:space="preserve">, </w:t>
+      </w:r>
+      <w:hyperlink r:id="rIdLink10" w:history="1">
         <w:r>
           <w:rPr>
             <w:rStyle w:val="Hyperlink"/>
@@ -997,9 +1008,44 @@
         </w:r>
       </w:hyperlink>
       <w:r>
+        <w:t xml:space="preserve"> and </w:t>
+      </w:r>
+      <w:hyperlink r:id="rIdLink11" w:history="1">
+        <w:r>
+          <w:rPr>
+            <w:rStyle w:val="Hyperlink"/>
+          </w:rPr>
+          <w:t xml:space="preserve">Amazon VPC</w:t>
+        </w:r>
+      </w:hyperlink>
+      <w:r>
+        <w:t xml:space="preserve"> (published 16 October 2026)</w:t>
+      </w:r>
+    </w:p>
+    <w:p>
+      <w:pPr>
+        <w:pStyle w:val="ListParagraph"/>
+        <w:numPr>
+          <w:ilvl w:val="0"/>
+          <w:numId w:val="2"/>
+        </w:numPr>
+        <w:spacing w:after="80"/>
+      </w:pPr>
+      <w:r>
+        <w:t xml:space="preserve">AWS pricing: </w:t>
+      </w:r>
+      <w:hyperlink r:id="rIdLink12" w:history="1">
+        <w:r>
+          <w:rPr>
+            <w:rStyle w:val="Hyperlink"/>
+          </w:rPr>
+          <w:t xml:space="preserve">Elastic Load Balancing</w:t>
+        </w:r>
+      </w:hyperlink>
+      <w:r>
         <w:t xml:space="preserve">, </w:t>
       </w:r>
-      <w:hyperlink r:id="rIdLink10" w:history="1">
+      <w:hyperlink r:id="rIdLink13" w:history="1">
         <w:r>
           <w:rPr>
             <w:rStyle w:val="Hyperlink"/>
@@ -1010,7 +1056,7 @@
       <w:r>
         <w:t xml:space="preserve">, </w:t>
       </w:r>
-      <w:hyperlink r:id="rIdLink11" w:history="1">
+      <w:hyperlink r:id="rIdLink14" w:history="1">
         <w:r>
           <w:rPr>
             <w:rStyle w:val="Hyperlink"/>
@@ -1042,7 +1088,7 @@
         <w:spacing w:after="200"/>
       </w:pPr>
       <w:r>
-        <w:t xml:space="preserve">I chose the third option: a network spread across </w:t>
+        <w:t xml:space="preserve">I chose the third option. The order system runs in </w:t>
       </w:r>
       <w:r>
         <w:rPr>
@@ -1052,27 +1098,95 @@
         <w:t xml:space="preserve">two Availability Zones</w:t>
       </w:r>
       <w:r>
-        <w:t xml:space="preserve">, where a </w:t>
-      </w:r>
+        <w:t xml:space="preserve"> (eu-west-1a and eu-west-1b), and it is built in layers where each layer only accepts traffic from the layer in front of it:</w:t>
+      </w:r>
+    </w:p>
+    <w:p>
+      <w:pPr>
+        <w:pStyle w:val="ListParagraph"/>
+        <w:numPr>
+          <w:ilvl w:val="0"/>
+          <w:numId w:val="2"/>
+        </w:numPr>
+        <w:spacing w:after="80"/>
+      </w:pPr>
       <w:r>
         <w:rPr>
           <w:b/>
           <w:bCs/>
         </w:rPr>
-        <w:t xml:space="preserve">load balancer</w:t>
-      </w:r>
-      <w:r>
-        <w:t xml:space="preserve"> is the only thing the internet can reach. The web servers and order servers sit in </w:t>
-      </w:r>
+        <w:t xml:space="preserve">Internet-facing load balancer</w:t>
+      </w:r>
+      <w:r>
+        <w:t xml:space="preserve"> (onward-dev-web-alb), the only thing the internet can reach, in the public subnets.</w:t>
+      </w:r>
+    </w:p>
+    <w:p>
+      <w:pPr>
+        <w:pStyle w:val="ListParagraph"/>
+        <w:numPr>
+          <w:ilvl w:val="0"/>
+          <w:numId w:val="2"/>
+        </w:numPr>
+        <w:spacing w:after="80"/>
+      </w:pPr>
       <w:r>
         <w:rPr>
           <w:b/>
           <w:bCs/>
         </w:rPr>
-        <w:t xml:space="preserve">private subnets</w:t>
-      </w:r>
-      <w:r>
-        <w:t xml:space="preserve">, a single </w:t>
+        <w:t xml:space="preserve">Web servers</w:t>
+      </w:r>
+      <w:r>
+        <w:t xml:space="preserve"> (onward-dev-web-asg), one in each zone's private subnet, which serve the merchant and customer front end.</w:t>
+      </w:r>
+    </w:p>
+    <w:p>
+      <w:pPr>
+        <w:pStyle w:val="ListParagraph"/>
+        <w:numPr>
+          <w:ilvl w:val="0"/>
+          <w:numId w:val="2"/>
+        </w:numPr>
+        <w:spacing w:after="80"/>
+      </w:pPr>
+      <w:r>
+        <w:rPr>
+          <w:b/>
+          <w:bCs/>
+        </w:rPr>
+        <w:t xml:space="preserve">Internal load balancer</w:t>
+      </w:r>
+      <w:r>
+        <w:t xml:space="preserve"> (onward-dev-orders-alb), with no public address, which the web servers use to reach the order services.</w:t>
+      </w:r>
+    </w:p>
+    <w:p>
+      <w:pPr>
+        <w:pStyle w:val="ListParagraph"/>
+        <w:numPr>
+          <w:ilvl w:val="0"/>
+          <w:numId w:val="2"/>
+        </w:numPr>
+        <w:spacing w:after="80"/>
+      </w:pPr>
+      <w:r>
+        <w:rPr>
+          <w:b/>
+          <w:bCs/>
+        </w:rPr>
+        <w:t xml:space="preserve">Order servers</w:t>
+      </w:r>
+      <w:r>
+        <w:t xml:space="preserve"> (onward-dev-orders-asg), one in each zone's private subnet, which only the internal load balancer can reach.</w:t>
+      </w:r>
+    </w:p>
+    <w:p>
+      <w:pPr>
+        <w:spacing w:after="200"/>
+      </w:pPr>
+      <w:r>
+        <w:t xml:space="preserve">A single </w:t>
       </w:r>
       <w:r>
         <w:rPr>
@@ -1082,7 +1196,7 @@
         <w:t xml:space="preserve">regional NAT gateway</w:t>
       </w:r>
       <w:r>
-        <w:t xml:space="preserve"> serves both zones for outbound updates, and engineers administer servers through </w:t>
+        <w:t xml:space="preserve"> lets the private servers download updates without being reachable from the internet, and engineers administer every server through </w:t>
       </w:r>
       <w:r>
         <w:rPr>
@@ -1092,7 +1206,7 @@
         <w:t xml:space="preserve">Session Manager</w:t>
       </w:r>
       <w:r>
-        <w:t xml:space="preserve">.</w:t>
+        <w:t xml:space="preserve">, with no open admin port and no keys.</w:t>
       </w:r>
     </w:p>
     <w:p>
@@ -1100,25 +1214,96 @@
         <w:spacing w:after="200"/>
       </w:pPr>
       <w:r>
-        <w:t xml:space="preserve">It suits Onward because it answers all four leaders at once. The website keeps serving if a whole Availability Zone fails, which is the company's first priority (“grow without breaking”). Nothing internal has a public address. Engineers get a shell without any open port or shared key. The extra cost is a small, predictable hourly amount that can be explained line by line.</w:t>
-      </w:r>
-    </w:p>
-    <w:p>
-      <w:pPr>
-        <w:spacing w:after="200"/>
-      </w:pPr>
-      <w:r>
-        <w:t xml:space="preserve">I chose a </w:t>
-      </w:r>
+        <w:t xml:space="preserve">It suits Onward because it answers all four leaders at once. The website and the order services both keep working if a whole zone fails, which is the company's first priority (“grow without breaking”). Nothing internal has a public address. Engineers get a shell without any open port or shared key. The extra cost is a predictable hourly amount that is explained line by line below.</w:t>
+      </w:r>
+    </w:p>
+    <w:p>
+      <w:pPr>
+        <w:pStyle w:val="Heading3"/>
+        <w:spacing w:before="200" w:after="80"/>
+      </w:pPr>
+      <w:r>
+        <w:t xml:space="preserve">Key design choices</w:t>
+      </w:r>
+    </w:p>
+    <w:p>
+      <w:pPr>
+        <w:pStyle w:val="ListParagraph"/>
+        <w:numPr>
+          <w:ilvl w:val="0"/>
+          <w:numId w:val="2"/>
+        </w:numPr>
+        <w:spacing w:after="80"/>
+      </w:pPr>
       <w:r>
         <w:rPr>
           <w:b/>
           <w:bCs/>
         </w:rPr>
-        <w:t xml:space="preserve">regional NAT gateway</w:t>
-      </w:r>
-      <w:r>
-        <w:t xml:space="preserve"> rather than a standard (zonal) NAT gateway. A zonal gateway lives in one Availability Zone, so one shared gateway would cut off updates in both zones if its zone failed, and the usual fix is one gateway per zone, each in its own public subnet with its own route table. A regional gateway gives the same resilience as one gateway per zone: it runs in every zone that has servers and follows them automatically. It needs no public subnet, and every private subnet uses one route table with a single route. That means fewer parts to misconfigure for a small platform team, at about the same cost.</w:t>
+        <w:t xml:space="preserve">Four servers, two per tier.</w:t>
+      </w:r>
+      <w:r>
+        <w:t xml:space="preserve"> One web and one order server in each zone, so losing a zone stops neither the website nor order processing, as the brief's high availability requirement asks. The second order server costs about USD 8 a month.</w:t>
+      </w:r>
+    </w:p>
+    <w:p>
+      <w:pPr>
+        <w:pStyle w:val="ListParagraph"/>
+        <w:numPr>
+          <w:ilvl w:val="0"/>
+          <w:numId w:val="2"/>
+        </w:numPr>
+        <w:spacing w:after="80"/>
+      </w:pPr>
+      <w:r>
+        <w:rPr>
+          <w:b/>
+          <w:bCs/>
+        </w:rPr>
+        <w:t xml:space="preserve">A separate internal load balancer.</w:t>
+      </w:r>
+      <w:r>
+        <w:t xml:space="preserve"> It gives the web servers one fixed name for the order servers, which change when replaced, and it has no public address. Sharing the public load balancer would put the order services on a public endpoint.</w:t>
+      </w:r>
+    </w:p>
+    <w:p>
+      <w:pPr>
+        <w:pStyle w:val="ListParagraph"/>
+        <w:numPr>
+          <w:ilvl w:val="0"/>
+          <w:numId w:val="2"/>
+        </w:numPr>
+        <w:spacing w:after="80"/>
+      </w:pPr>
+      <w:r>
+        <w:rPr>
+          <w:b/>
+          <w:bCs/>
+        </w:rPr>
+        <w:t xml:space="preserve">A regional NAT gateway.</w:t>
+      </w:r>
+      <w:r>
+        <w:t xml:space="preserve"> Same resilience and price as one NAT gateway per zone, but with no public subnet of its own and a single private route table, so there is less to misconfigure.</w:t>
+      </w:r>
+    </w:p>
+    <w:p>
+      <w:pPr>
+        <w:pStyle w:val="ListParagraph"/>
+        <w:numPr>
+          <w:ilvl w:val="0"/>
+          <w:numId w:val="2"/>
+        </w:numPr>
+        <w:spacing w:after="80"/>
+      </w:pPr>
+      <w:r>
+        <w:rPr>
+          <w:b/>
+          <w:bCs/>
+        </w:rPr>
+        <w:t xml:space="preserve">Software installed at boot.</w:t>
+      </w:r>
+      <w:r>
+        <w:t xml:space="preserve"> A startup script in the template installs each server's page, so every replacement is identical and patched, with no separate image pipeline. Servers only get traffic once their health check passes.</w:t>
       </w:r>
     </w:p>
     <w:p>
@@ -1353,7 +1538,7 @@
           </w:tcPr>
           <w:p>
             <w:r>
-              <w:t xml:space="preserve">Application Load Balancer</w:t>
+              <w:t xml:space="preserve">Application Load Balancer, internet-facing (onward-dev-web-alb)</w:t>
             </w:r>
           </w:p>
         </w:tc>
@@ -1375,7 +1560,7 @@
           </w:tcPr>
           <w:p>
             <w:r>
-              <w:t xml:space="preserve">Receives all web traffic and spreads it across healthy web servers in both zones.</w:t>
+              <w:t xml:space="preserve">The single front door. Receives web traffic on port 80 and spreads it across healthy web servers in both zones.</w:t>
             </w:r>
           </w:p>
         </w:tc>
@@ -1397,7 +1582,7 @@
           </w:tcPr>
           <w:p>
             <w:r>
-              <w:t xml:space="preserve">The single, stable front door. It runs in both zones and stops sending traffic to an unhealthy server or a failed zone.</w:t>
+              <w:t xml:space="preserve">Runs in both zones and stops sending traffic to an unhealthy server or a failed zone. It is the only resource the internet can reach.</w:t>
             </w:r>
           </w:p>
         </w:tc>
@@ -1430,7 +1615,7 @@
           </w:tcPr>
           <w:p>
             <w:r>
-              <w:t xml:space="preserve">EC2 Auto Scaling group (front end, minimum 2, one per zone)</w:t>
+              <w:t xml:space="preserve">Application Load Balancer, internal (onward-dev-orders-alb)</w:t>
             </w:r>
           </w:p>
         </w:tc>
@@ -1452,7 +1637,7 @@
           </w:tcPr>
           <w:p>
             <w:r>
-              <w:t xml:space="preserve">Keeps the web servers running and replaces any that fail.</w:t>
+              <w:t xml:space="preserve">Gives the web servers one fixed name for the order services on port 8080, and spreads calls across healthy order servers in both zones.</w:t>
             </w:r>
           </w:p>
         </w:tc>
@@ -1474,7 +1659,7 @@
           </w:tcPr>
           <w:p>
             <w:r>
-              <w:t xml:space="preserve">If a server or a zone is lost, a replacement launches automatically in a healthy zone, so nobody has to be woken up. It is also the starting point for scaling on sales days.</w:t>
+              <w:t xml:space="preserve">Internal, so it has no public address. Order servers can be replaced without the web tier needing to know.</w:t>
             </w:r>
           </w:p>
         </w:tc>
@@ -1507,7 +1692,7 @@
           </w:tcPr>
           <w:p>
             <w:r>
-              <w:t xml:space="preserve">Amazon EC2 (Amazon Linux 2023, t3.micro)</w:t>
+              <w:t xml:space="preserve">EC2 Auto Scaling groups (onward-dev-web-asg and onward-dev-orders-asg, 2 servers each, one per zone)</w:t>
             </w:r>
           </w:p>
         </w:tc>
@@ -1529,7 +1714,7 @@
           </w:tcPr>
           <w:p>
             <w:r>
-              <w:t xml:space="preserve">Runs the web front end and the internal order services.</w:t>
+              <w:t xml:space="preserve">Keep each tier running and replace any server that fails.</w:t>
             </w:r>
           </w:p>
         </w:tc>
@@ -1551,7 +1736,7 @@
           </w:tcPr>
           <w:p>
             <w:r>
-              <w:t xml:space="preserve">Free Tier eligible. Each web server installs its page at boot from the template, so every replacement server is identical.</w:t>
+              <w:t xml:space="preserve">If a server or a zone is lost, a replacement launches automatically, so nobody has to be woken up. Each group can grow to 4 servers for sales days.</w:t>
             </w:r>
           </w:p>
         </w:tc>
@@ -1584,7 +1769,7 @@
           </w:tcPr>
           <w:p>
             <w:r>
-              <w:t xml:space="preserve">Security groups</w:t>
+              <w:t xml:space="preserve">Amazon EC2 (Amazon Linux 2023, t3.micro)</w:t>
             </w:r>
           </w:p>
         </w:tc>
@@ -1606,7 +1791,7 @@
           </w:tcPr>
           <w:p>
             <w:r>
-              <w:t xml:space="preserve">Firewall rules for each server role.</w:t>
+              <w:t xml:space="preserve">Runs the web front end and the internal order services.</w:t>
             </w:r>
           </w:p>
         </w:tc>
@@ -1628,7 +1813,7 @@
           </w:tcPr>
           <w:p>
             <w:r>
-              <w:t xml:space="preserve">The load balancer accepts web traffic from anyone. Web servers accept traffic only from the load balancer, and order servers only from the web servers. No security group allows SSH or any admin port.</w:t>
+              <w:t xml:space="preserve">Free Tier eligible. Servers have no public IP address and no SSH key. Each installs its software at boot, so every replacement is identical.</w:t>
             </w:r>
           </w:p>
         </w:tc>
@@ -1661,7 +1846,7 @@
           </w:tcPr>
           <w:p>
             <w:r>
-              <w:t xml:space="preserve">Regional NAT gateway</w:t>
+              <w:t xml:space="preserve">Security groups (4, one per layer)</w:t>
             </w:r>
           </w:p>
         </w:tc>
@@ -1683,7 +1868,7 @@
           </w:tcPr>
           <w:p>
             <w:r>
-              <w:t xml:space="preserve">Lets private servers start outbound connections, for example to download packages, while blocking connections that start from the internet.</w:t>
+              <w:t xml:space="preserve">A firewall for each layer.</w:t>
             </w:r>
           </w:p>
         </w:tc>
@@ -1705,7 +1890,7 @@
           </w:tcPr>
           <w:p>
             <w:r>
-              <w:t xml:space="preserve">Meets the Head of Operations' need for updates without giving internal servers a public address. It runs in each zone that has servers, so a zone failure doesn't cut off the other zone. It needs no public subnet of its own and only one private route table, so there is less to get wrong.</w:t>
+              <w:t xml:space="preserve">Web load balancer: port 80 from anyone. Web servers: port 80 only from the web load balancer. Internal load balancer: port 8080 only from the web servers. Order servers: port 8080 only from the internal load balancer. No security group allows SSH or any admin port.</w:t>
             </w:r>
           </w:p>
         </w:tc>
@@ -1738,7 +1923,7 @@
           </w:tcPr>
           <w:p>
             <w:r>
-              <w:t xml:space="preserve">AWS Systems Manager Session Manager</w:t>
+              <w:t xml:space="preserve">Regional NAT gateway</w:t>
             </w:r>
           </w:p>
         </w:tc>
@@ -1760,7 +1945,7 @@
           </w:tcPr>
           <w:p>
             <w:r>
-              <w:t xml:space="preserve">Gives engineers a shell on any server from the console or CLI.</w:t>
+              <w:t xml:space="preserve">Lets private servers start outbound connections, for example to download packages, while blocking connections that start from the internet.</w:t>
             </w:r>
           </w:p>
         </w:tc>
@@ -1782,7 +1967,7 @@
           </w:tcPr>
           <w:p>
             <w:r>
-              <w:t xml:space="preserve">No inbound port and no SSH keys, and each session is tied to the engineer's own IAM identity. Servers get access through the AWS managed policy AmazonSSMManagedInstanceCore, with no inline policies.</w:t>
+              <w:t xml:space="preserve">Meets the Head of Operations' need for updates without giving any server a public address. It runs in each zone that has servers, so a zone failure doesn't cut off the other zone.</w:t>
             </w:r>
           </w:p>
         </w:tc>
@@ -1815,6 +2000,83 @@
           </w:tcPr>
           <w:p>
             <w:r>
+              <w:t xml:space="preserve">AWS Systems Manager Session Manager</w:t>
+            </w:r>
+          </w:p>
+        </w:tc>
+        <w:tc>
+          <w:tcPr>
+            <w:tcW w:w="3600" w:type="dxa"/>
+            <w:tcBorders>
+              <w:top w:val="single" w:sz="4" w:space="0" w:color="BFBFBF"/>
+              <w:left w:val="single" w:sz="4" w:space="0" w:color="BFBFBF"/>
+              <w:bottom w:val="single" w:sz="4" w:space="0" w:color="BFBFBF"/>
+              <w:right w:val="single" w:sz="4" w:space="0" w:color="BFBFBF"/>
+            </w:tcBorders>
+            <w:tcMar>
+              <w:top w:w="60" w:type="dxa"/>
+              <w:left w:w="100" w:type="dxa"/>
+              <w:bottom w:w="60" w:type="dxa"/>
+              <w:right w:w="100" w:type="dxa"/>
+            </w:tcMar>
+          </w:tcPr>
+          <w:p>
+            <w:r>
+              <w:t xml:space="preserve">Gives engineers a shell on any server from the console or CLI.</w:t>
+            </w:r>
+          </w:p>
+        </w:tc>
+        <w:tc>
+          <w:tcPr>
+            <w:tcW w:w="4080" w:type="dxa"/>
+            <w:tcBorders>
+              <w:top w:val="single" w:sz="4" w:space="0" w:color="BFBFBF"/>
+              <w:left w:val="single" w:sz="4" w:space="0" w:color="BFBFBF"/>
+              <w:bottom w:val="single" w:sz="4" w:space="0" w:color="BFBFBF"/>
+              <w:right w:val="single" w:sz="4" w:space="0" w:color="BFBFBF"/>
+            </w:tcBorders>
+            <w:tcMar>
+              <w:top w:w="60" w:type="dxa"/>
+              <w:left w:w="100" w:type="dxa"/>
+              <w:bottom w:w="60" w:type="dxa"/>
+              <w:right w:w="100" w:type="dxa"/>
+            </w:tcMar>
+          </w:tcPr>
+          <w:p>
+            <w:r>
+              <w:t xml:space="preserve">No inbound port and no SSH keys: the agent on each server connects out to Systems Manager. Each session is tied to the engineer's own IAM identity. Servers get access through the AWS managed policy AmazonSSMManagedInstanceCore, with no inline policies.</w:t>
+            </w:r>
+          </w:p>
+        </w:tc>
+      </w:tr>
+      <w:tr>
+        <w:tblPrEx>
+          <w:tblCellMar>
+            <w:top w:w="0" w:type="dxa"/>
+            <w:bottom w:w="0" w:type="dxa"/>
+          </w:tblCellMar>
+        </w:tblPrEx>
+        <w:trPr>
+          <w:cantSplit/>
+        </w:trPr>
+        <w:tc>
+          <w:tcPr>
+            <w:tcW w:w="2400" w:type="dxa"/>
+            <w:tcBorders>
+              <w:top w:val="single" w:sz="4" w:space="0" w:color="BFBFBF"/>
+              <w:left w:val="single" w:sz="4" w:space="0" w:color="BFBFBF"/>
+              <w:bottom w:val="single" w:sz="4" w:space="0" w:color="BFBFBF"/>
+              <w:right w:val="single" w:sz="4" w:space="0" w:color="BFBFBF"/>
+            </w:tcBorders>
+            <w:tcMar>
+              <w:top w:w="60" w:type="dxa"/>
+              <w:left w:w="100" w:type="dxa"/>
+              <w:bottom w:w="60" w:type="dxa"/>
+              <w:right w:w="100" w:type="dxa"/>
+            </w:tcMar>
+          </w:tcPr>
+          <w:p>
+            <w:r>
               <w:t xml:space="preserve">AWS CloudFormation with Git sync</w:t>
             </w:r>
           </w:p>
@@ -1884,7 +2146,7 @@
         <w:spacing w:after="120"/>
       </w:pPr>
       <w:r>
-        <w:t xml:space="preserve">Approximate on-demand prices in eu-west-1 (Ireland), for a month of 730 hours:</w:t>
+        <w:t xml:space="preserve">On-demand prices for eu-west-1 (Ireland), taken from the AWS Price List published on 16 October 2026, for a month of 730 hours:</w:t>
       </w:r>
     </w:p>
     <w:tbl>
@@ -1905,9 +2167,9 @@
         <w:tblLook w:val="0000" w:firstRow="0" w:lastRow="0" w:firstColumn="0" w:lastColumn="0" w:noHBand="0" w:noVBand="0"/>
       </w:tblPr>
       <w:tblGrid>
-        <w:gridCol w:w="4200"/>
-        <w:gridCol w:w="3480"/>
-        <w:gridCol w:w="2400"/>
+        <w:gridCol w:w="3600"/>
+        <w:gridCol w:w="3880"/>
+        <w:gridCol w:w="2600"/>
       </w:tblGrid>
       <w:tr>
         <w:tblPrEx>
@@ -1922,7 +2184,7 @@
         </w:trPr>
         <w:tc>
           <w:tcPr>
-            <w:tcW w:w="4200" w:type="dxa"/>
+            <w:tcW w:w="3600" w:type="dxa"/>
             <w:tcBorders>
               <w:top w:val="single" w:sz="4" w:space="0" w:color="BFBFBF"/>
               <w:left w:val="single" w:sz="4" w:space="0" w:color="BFBFBF"/>
@@ -1950,7 +2212,7 @@
         </w:tc>
         <w:tc>
           <w:tcPr>
-            <w:tcW w:w="3480" w:type="dxa"/>
+            <w:tcW w:w="3880" w:type="dxa"/>
             <w:tcBorders>
               <w:top w:val="single" w:sz="4" w:space="0" w:color="BFBFBF"/>
               <w:left w:val="single" w:sz="4" w:space="0" w:color="BFBFBF"/>
@@ -1978,7 +2240,7 @@
         </w:tc>
         <w:tc>
           <w:tcPr>
-            <w:tcW w:w="2400" w:type="dxa"/>
+            <w:tcW w:w="2600" w:type="dxa"/>
             <w:tcBorders>
               <w:top w:val="single" w:sz="4" w:space="0" w:color="BFBFBF"/>
               <w:left w:val="single" w:sz="4" w:space="0" w:color="BFBFBF"/>
@@ -2017,67 +2279,67 @@
         </w:trPr>
         <w:tc>
           <w:tcPr>
-            <w:tcW w:w="4200" w:type="dxa"/>
-            <w:tcBorders>
-              <w:top w:val="single" w:sz="4" w:space="0" w:color="BFBFBF"/>
-              <w:left w:val="single" w:sz="4" w:space="0" w:color="BFBFBF"/>
-              <w:bottom w:val="single" w:sz="4" w:space="0" w:color="BFBFBF"/>
-              <w:right w:val="single" w:sz="4" w:space="0" w:color="BFBFBF"/>
-            </w:tcBorders>
-            <w:tcMar>
-              <w:top w:w="60" w:type="dxa"/>
-              <w:left w:w="100" w:type="dxa"/>
-              <w:bottom w:w="60" w:type="dxa"/>
-              <w:right w:w="100" w:type="dxa"/>
-            </w:tcMar>
-          </w:tcPr>
-          <w:p>
-            <w:r>
-              <w:t xml:space="preserve">Application Load Balancer</w:t>
-            </w:r>
-          </w:p>
-        </w:tc>
-        <w:tc>
-          <w:tcPr>
-            <w:tcW w:w="3480" w:type="dxa"/>
-            <w:tcBorders>
-              <w:top w:val="single" w:sz="4" w:space="0" w:color="BFBFBF"/>
-              <w:left w:val="single" w:sz="4" w:space="0" w:color="BFBFBF"/>
-              <w:bottom w:val="single" w:sz="4" w:space="0" w:color="BFBFBF"/>
-              <w:right w:val="single" w:sz="4" w:space="0" w:color="BFBFBF"/>
-            </w:tcBorders>
-            <w:tcMar>
-              <w:top w:w="60" w:type="dxa"/>
-              <w:left w:w="100" w:type="dxa"/>
-              <w:bottom w:w="60" w:type="dxa"/>
-              <w:right w:w="100" w:type="dxa"/>
-            </w:tcMar>
-          </w:tcPr>
-          <w:p>
-            <w:r>
-              <w:t xml:space="preserve">USD 0.0252 per hour, plus a small usage charge (LCU)</w:t>
-            </w:r>
-          </w:p>
-        </w:tc>
-        <w:tc>
-          <w:tcPr>
-            <w:tcW w:w="2400" w:type="dxa"/>
-            <w:tcBorders>
-              <w:top w:val="single" w:sz="4" w:space="0" w:color="BFBFBF"/>
-              <w:left w:val="single" w:sz="4" w:space="0" w:color="BFBFBF"/>
-              <w:bottom w:val="single" w:sz="4" w:space="0" w:color="BFBFBF"/>
-              <w:right w:val="single" w:sz="4" w:space="0" w:color="BFBFBF"/>
-            </w:tcBorders>
-            <w:tcMar>
-              <w:top w:w="60" w:type="dxa"/>
-              <w:left w:w="100" w:type="dxa"/>
-              <w:bottom w:w="60" w:type="dxa"/>
-              <w:right w:w="100" w:type="dxa"/>
-            </w:tcMar>
-          </w:tcPr>
-          <w:p>
-            <w:r>
-              <w:t xml:space="preserve">about USD 18 + usage</w:t>
+            <w:tcW w:w="3600" w:type="dxa"/>
+            <w:tcBorders>
+              <w:top w:val="single" w:sz="4" w:space="0" w:color="BFBFBF"/>
+              <w:left w:val="single" w:sz="4" w:space="0" w:color="BFBFBF"/>
+              <w:bottom w:val="single" w:sz="4" w:space="0" w:color="BFBFBF"/>
+              <w:right w:val="single" w:sz="4" w:space="0" w:color="BFBFBF"/>
+            </w:tcBorders>
+            <w:tcMar>
+              <w:top w:w="60" w:type="dxa"/>
+              <w:left w:w="100" w:type="dxa"/>
+              <w:bottom w:w="60" w:type="dxa"/>
+              <w:right w:w="100" w:type="dxa"/>
+            </w:tcMar>
+          </w:tcPr>
+          <w:p>
+            <w:r>
+              <w:t xml:space="preserve">Application Load Balancers (2: web and internal)</w:t>
+            </w:r>
+          </w:p>
+        </w:tc>
+        <w:tc>
+          <w:tcPr>
+            <w:tcW w:w="3880" w:type="dxa"/>
+            <w:tcBorders>
+              <w:top w:val="single" w:sz="4" w:space="0" w:color="BFBFBF"/>
+              <w:left w:val="single" w:sz="4" w:space="0" w:color="BFBFBF"/>
+              <w:bottom w:val="single" w:sz="4" w:space="0" w:color="BFBFBF"/>
+              <w:right w:val="single" w:sz="4" w:space="0" w:color="BFBFBF"/>
+            </w:tcBorders>
+            <w:tcMar>
+              <w:top w:w="60" w:type="dxa"/>
+              <w:left w:w="100" w:type="dxa"/>
+              <w:bottom w:w="60" w:type="dxa"/>
+              <w:right w:w="100" w:type="dxa"/>
+            </w:tcMar>
+          </w:tcPr>
+          <w:p>
+            <w:r>
+              <w:t xml:space="preserve">USD 0.0252 per hour each, plus USD 0.008 per capacity unit-hour (LCU) used</w:t>
+            </w:r>
+          </w:p>
+        </w:tc>
+        <w:tc>
+          <w:tcPr>
+            <w:tcW w:w="2600" w:type="dxa"/>
+            <w:tcBorders>
+              <w:top w:val="single" w:sz="4" w:space="0" w:color="BFBFBF"/>
+              <w:left w:val="single" w:sz="4" w:space="0" w:color="BFBFBF"/>
+              <w:bottom w:val="single" w:sz="4" w:space="0" w:color="BFBFBF"/>
+              <w:right w:val="single" w:sz="4" w:space="0" w:color="BFBFBF"/>
+            </w:tcBorders>
+            <w:tcMar>
+              <w:top w:w="60" w:type="dxa"/>
+              <w:left w:w="100" w:type="dxa"/>
+              <w:bottom w:w="60" w:type="dxa"/>
+              <w:right w:w="100" w:type="dxa"/>
+            </w:tcMar>
+          </w:tcPr>
+          <w:p>
+            <w:r>
+              <w:t xml:space="preserve">USD 36.79 + usage</w:t>
             </w:r>
           </w:p>
         </w:tc>
@@ -2094,7 +2356,7 @@
         </w:trPr>
         <w:tc>
           <w:tcPr>
-            <w:tcW w:w="4200" w:type="dxa"/>
+            <w:tcW w:w="3600" w:type="dxa"/>
             <w:tcBorders>
               <w:top w:val="single" w:sz="4" w:space="0" w:color="BFBFBF"/>
               <w:left w:val="single" w:sz="4" w:space="0" w:color="BFBFBF"/>
@@ -2116,7 +2378,7 @@
         </w:tc>
         <w:tc>
           <w:tcPr>
-            <w:tcW w:w="3480" w:type="dxa"/>
+            <w:tcW w:w="3880" w:type="dxa"/>
             <w:tcBorders>
               <w:top w:val="single" w:sz="4" w:space="0" w:color="BFBFBF"/>
               <w:left w:val="single" w:sz="4" w:space="0" w:color="BFBFBF"/>
@@ -2138,23 +2400,23 @@
         </w:tc>
         <w:tc>
           <w:tcPr>
-            <w:tcW w:w="2400" w:type="dxa"/>
-            <w:tcBorders>
-              <w:top w:val="single" w:sz="4" w:space="0" w:color="BFBFBF"/>
-              <w:left w:val="single" w:sz="4" w:space="0" w:color="BFBFBF"/>
-              <w:bottom w:val="single" w:sz="4" w:space="0" w:color="BFBFBF"/>
-              <w:right w:val="single" w:sz="4" w:space="0" w:color="BFBFBF"/>
-            </w:tcBorders>
-            <w:tcMar>
-              <w:top w:w="60" w:type="dxa"/>
-              <w:left w:w="100" w:type="dxa"/>
-              <w:bottom w:w="60" w:type="dxa"/>
-              <w:right w:w="100" w:type="dxa"/>
-            </w:tcMar>
-          </w:tcPr>
-          <w:p>
-            <w:r>
-              <w:t xml:space="preserve">about USD 70 + data</w:t>
+            <w:tcW w:w="2600" w:type="dxa"/>
+            <w:tcBorders>
+              <w:top w:val="single" w:sz="4" w:space="0" w:color="BFBFBF"/>
+              <w:left w:val="single" w:sz="4" w:space="0" w:color="BFBFBF"/>
+              <w:bottom w:val="single" w:sz="4" w:space="0" w:color="BFBFBF"/>
+              <w:right w:val="single" w:sz="4" w:space="0" w:color="BFBFBF"/>
+            </w:tcBorders>
+            <w:tcMar>
+              <w:top w:w="60" w:type="dxa"/>
+              <w:left w:w="100" w:type="dxa"/>
+              <w:bottom w:w="60" w:type="dxa"/>
+              <w:right w:w="100" w:type="dxa"/>
+            </w:tcMar>
+          </w:tcPr>
+          <w:p>
+            <w:r>
+              <w:t xml:space="preserve">USD 70.08 + data</w:t>
             </w:r>
           </w:p>
         </w:tc>
@@ -2171,29 +2433,29 @@
         </w:trPr>
         <w:tc>
           <w:tcPr>
-            <w:tcW w:w="4200" w:type="dxa"/>
-            <w:tcBorders>
-              <w:top w:val="single" w:sz="4" w:space="0" w:color="BFBFBF"/>
-              <w:left w:val="single" w:sz="4" w:space="0" w:color="BFBFBF"/>
-              <w:bottom w:val="single" w:sz="4" w:space="0" w:color="BFBFBF"/>
-              <w:right w:val="single" w:sz="4" w:space="0" w:color="BFBFBF"/>
-            </w:tcBorders>
-            <w:tcMar>
-              <w:top w:w="60" w:type="dxa"/>
-              <w:left w:w="100" w:type="dxa"/>
-              <w:bottom w:w="60" w:type="dxa"/>
-              <w:right w:w="100" w:type="dxa"/>
-            </w:tcMar>
-          </w:tcPr>
-          <w:p>
-            <w:r>
-              <w:t xml:space="preserve">Public IPv4 addresses (NAT gateway, one per zone, and load balancer)</w:t>
-            </w:r>
-          </w:p>
-        </w:tc>
-        <w:tc>
-          <w:tcPr>
-            <w:tcW w:w="3480" w:type="dxa"/>
+            <w:tcW w:w="3600" w:type="dxa"/>
+            <w:tcBorders>
+              <w:top w:val="single" w:sz="4" w:space="0" w:color="BFBFBF"/>
+              <w:left w:val="single" w:sz="4" w:space="0" w:color="BFBFBF"/>
+              <w:bottom w:val="single" w:sz="4" w:space="0" w:color="BFBFBF"/>
+              <w:right w:val="single" w:sz="4" w:space="0" w:color="BFBFBF"/>
+            </w:tcBorders>
+            <w:tcMar>
+              <w:top w:w="60" w:type="dxa"/>
+              <w:left w:w="100" w:type="dxa"/>
+              <w:bottom w:w="60" w:type="dxa"/>
+              <w:right w:w="100" w:type="dxa"/>
+            </w:tcMar>
+          </w:tcPr>
+          <w:p>
+            <w:r>
+              <w:t xml:space="preserve">Public IPv4 addresses (4: web load balancer and NAT gateway, one each per zone)</w:t>
+            </w:r>
+          </w:p>
+        </w:tc>
+        <w:tc>
+          <w:tcPr>
+            <w:tcW w:w="3880" w:type="dxa"/>
             <w:tcBorders>
               <w:top w:val="single" w:sz="4" w:space="0" w:color="BFBFBF"/>
               <w:left w:val="single" w:sz="4" w:space="0" w:color="BFBFBF"/>
@@ -2215,23 +2477,23 @@
         </w:tc>
         <w:tc>
           <w:tcPr>
-            <w:tcW w:w="2400" w:type="dxa"/>
-            <w:tcBorders>
-              <w:top w:val="single" w:sz="4" w:space="0" w:color="BFBFBF"/>
-              <w:left w:val="single" w:sz="4" w:space="0" w:color="BFBFBF"/>
-              <w:bottom w:val="single" w:sz="4" w:space="0" w:color="BFBFBF"/>
-              <w:right w:val="single" w:sz="4" w:space="0" w:color="BFBFBF"/>
-            </w:tcBorders>
-            <w:tcMar>
-              <w:top w:w="60" w:type="dxa"/>
-              <w:left w:w="100" w:type="dxa"/>
-              <w:bottom w:w="60" w:type="dxa"/>
-              <w:right w:w="100" w:type="dxa"/>
-            </w:tcMar>
-          </w:tcPr>
-          <w:p>
-            <w:r>
-              <w:t xml:space="preserve">about USD 4 each</w:t>
+            <w:tcW w:w="2600" w:type="dxa"/>
+            <w:tcBorders>
+              <w:top w:val="single" w:sz="4" w:space="0" w:color="BFBFBF"/>
+              <w:left w:val="single" w:sz="4" w:space="0" w:color="BFBFBF"/>
+              <w:bottom w:val="single" w:sz="4" w:space="0" w:color="BFBFBF"/>
+              <w:right w:val="single" w:sz="4" w:space="0" w:color="BFBFBF"/>
+            </w:tcBorders>
+            <w:tcMar>
+              <w:top w:w="60" w:type="dxa"/>
+              <w:left w:w="100" w:type="dxa"/>
+              <w:bottom w:w="60" w:type="dxa"/>
+              <w:right w:w="100" w:type="dxa"/>
+            </w:tcMar>
+          </w:tcPr>
+          <w:p>
+            <w:r>
+              <w:t xml:space="preserve">USD 14.60</w:t>
             </w:r>
           </w:p>
         </w:tc>
@@ -2248,67 +2510,229 @@
         </w:trPr>
         <w:tc>
           <w:tcPr>
-            <w:tcW w:w="4200" w:type="dxa"/>
-            <w:tcBorders>
-              <w:top w:val="single" w:sz="4" w:space="0" w:color="BFBFBF"/>
-              <w:left w:val="single" w:sz="4" w:space="0" w:color="BFBFBF"/>
-              <w:bottom w:val="single" w:sz="4" w:space="0" w:color="BFBFBF"/>
-              <w:right w:val="single" w:sz="4" w:space="0" w:color="BFBFBF"/>
-            </w:tcBorders>
-            <w:tcMar>
-              <w:top w:w="60" w:type="dxa"/>
-              <w:left w:w="100" w:type="dxa"/>
-              <w:bottom w:w="60" w:type="dxa"/>
-              <w:right w:w="100" w:type="dxa"/>
-            </w:tcMar>
-          </w:tcPr>
-          <w:p>
-            <w:r>
-              <w:t xml:space="preserve">EC2 t3.micro servers</w:t>
-            </w:r>
-          </w:p>
-        </w:tc>
-        <w:tc>
-          <w:tcPr>
-            <w:tcW w:w="3480" w:type="dxa"/>
-            <w:tcBorders>
-              <w:top w:val="single" w:sz="4" w:space="0" w:color="BFBFBF"/>
-              <w:left w:val="single" w:sz="4" w:space="0" w:color="BFBFBF"/>
-              <w:bottom w:val="single" w:sz="4" w:space="0" w:color="BFBFBF"/>
-              <w:right w:val="single" w:sz="4" w:space="0" w:color="BFBFBF"/>
-            </w:tcBorders>
-            <w:tcMar>
-              <w:top w:w="60" w:type="dxa"/>
-              <w:left w:w="100" w:type="dxa"/>
-              <w:bottom w:w="60" w:type="dxa"/>
-              <w:right w:w="100" w:type="dxa"/>
-            </w:tcMar>
-          </w:tcPr>
-          <w:p>
-            <w:r>
-              <w:t xml:space="preserve">Free Tier</w:t>
-            </w:r>
-          </w:p>
-        </w:tc>
-        <w:tc>
-          <w:tcPr>
-            <w:tcW w:w="2400" w:type="dxa"/>
-            <w:tcBorders>
-              <w:top w:val="single" w:sz="4" w:space="0" w:color="BFBFBF"/>
-              <w:left w:val="single" w:sz="4" w:space="0" w:color="BFBFBF"/>
-              <w:bottom w:val="single" w:sz="4" w:space="0" w:color="BFBFBF"/>
-              <w:right w:val="single" w:sz="4" w:space="0" w:color="BFBFBF"/>
-            </w:tcBorders>
-            <w:tcMar>
-              <w:top w:w="60" w:type="dxa"/>
-              <w:left w:w="100" w:type="dxa"/>
-              <w:bottom w:w="60" w:type="dxa"/>
-              <w:right w:w="100" w:type="dxa"/>
-            </w:tcMar>
-          </w:tcPr>
-          <w:p>
-            <w:r>
-              <w:t xml:space="preserve">USD 0 within Free Tier limits</w:t>
+            <w:tcW w:w="3600" w:type="dxa"/>
+            <w:tcBorders>
+              <w:top w:val="single" w:sz="4" w:space="0" w:color="BFBFBF"/>
+              <w:left w:val="single" w:sz="4" w:space="0" w:color="BFBFBF"/>
+              <w:bottom w:val="single" w:sz="4" w:space="0" w:color="BFBFBF"/>
+              <w:right w:val="single" w:sz="4" w:space="0" w:color="BFBFBF"/>
+            </w:tcBorders>
+            <w:tcMar>
+              <w:top w:w="60" w:type="dxa"/>
+              <w:left w:w="100" w:type="dxa"/>
+              <w:bottom w:w="60" w:type="dxa"/>
+              <w:right w:w="100" w:type="dxa"/>
+            </w:tcMar>
+          </w:tcPr>
+          <w:p>
+            <w:r>
+              <w:t xml:space="preserve">EC2 t3.micro servers (4)</w:t>
+            </w:r>
+          </w:p>
+        </w:tc>
+        <w:tc>
+          <w:tcPr>
+            <w:tcW w:w="3880" w:type="dxa"/>
+            <w:tcBorders>
+              <w:top w:val="single" w:sz="4" w:space="0" w:color="BFBFBF"/>
+              <w:left w:val="single" w:sz="4" w:space="0" w:color="BFBFBF"/>
+              <w:bottom w:val="single" w:sz="4" w:space="0" w:color="BFBFBF"/>
+              <w:right w:val="single" w:sz="4" w:space="0" w:color="BFBFBF"/>
+            </w:tcBorders>
+            <w:tcMar>
+              <w:top w:w="60" w:type="dxa"/>
+              <w:left w:w="100" w:type="dxa"/>
+              <w:bottom w:w="60" w:type="dxa"/>
+              <w:right w:w="100" w:type="dxa"/>
+            </w:tcMar>
+          </w:tcPr>
+          <w:p>
+            <w:r>
+              <w:t xml:space="preserve">USD 0.0114 per hour each</w:t>
+            </w:r>
+          </w:p>
+        </w:tc>
+        <w:tc>
+          <w:tcPr>
+            <w:tcW w:w="2600" w:type="dxa"/>
+            <w:tcBorders>
+              <w:top w:val="single" w:sz="4" w:space="0" w:color="BFBFBF"/>
+              <w:left w:val="single" w:sz="4" w:space="0" w:color="BFBFBF"/>
+              <w:bottom w:val="single" w:sz="4" w:space="0" w:color="BFBFBF"/>
+              <w:right w:val="single" w:sz="4" w:space="0" w:color="BFBFBF"/>
+            </w:tcBorders>
+            <w:tcMar>
+              <w:top w:w="60" w:type="dxa"/>
+              <w:left w:w="100" w:type="dxa"/>
+              <w:bottom w:w="60" w:type="dxa"/>
+              <w:right w:w="100" w:type="dxa"/>
+            </w:tcMar>
+          </w:tcPr>
+          <w:p>
+            <w:r>
+              <w:t xml:space="preserve">USD 33.29</w:t>
+            </w:r>
+          </w:p>
+        </w:tc>
+      </w:tr>
+      <w:tr>
+        <w:tblPrEx>
+          <w:tblCellMar>
+            <w:top w:w="0" w:type="dxa"/>
+            <w:bottom w:w="0" w:type="dxa"/>
+          </w:tblCellMar>
+        </w:tblPrEx>
+        <w:trPr>
+          <w:cantSplit/>
+        </w:trPr>
+        <w:tc>
+          <w:tcPr>
+            <w:tcW w:w="3600" w:type="dxa"/>
+            <w:tcBorders>
+              <w:top w:val="single" w:sz="4" w:space="0" w:color="BFBFBF"/>
+              <w:left w:val="single" w:sz="4" w:space="0" w:color="BFBFBF"/>
+              <w:bottom w:val="single" w:sz="4" w:space="0" w:color="BFBFBF"/>
+              <w:right w:val="single" w:sz="4" w:space="0" w:color="BFBFBF"/>
+            </w:tcBorders>
+            <w:tcMar>
+              <w:top w:w="60" w:type="dxa"/>
+              <w:left w:w="100" w:type="dxa"/>
+              <w:bottom w:w="60" w:type="dxa"/>
+              <w:right w:w="100" w:type="dxa"/>
+            </w:tcMar>
+          </w:tcPr>
+          <w:p>
+            <w:r>
+              <w:t xml:space="preserve">EBS gp3 storage (4 × 8 GB)</w:t>
+            </w:r>
+          </w:p>
+        </w:tc>
+        <w:tc>
+          <w:tcPr>
+            <w:tcW w:w="3880" w:type="dxa"/>
+            <w:tcBorders>
+              <w:top w:val="single" w:sz="4" w:space="0" w:color="BFBFBF"/>
+              <w:left w:val="single" w:sz="4" w:space="0" w:color="BFBFBF"/>
+              <w:bottom w:val="single" w:sz="4" w:space="0" w:color="BFBFBF"/>
+              <w:right w:val="single" w:sz="4" w:space="0" w:color="BFBFBF"/>
+            </w:tcBorders>
+            <w:tcMar>
+              <w:top w:w="60" w:type="dxa"/>
+              <w:left w:w="100" w:type="dxa"/>
+              <w:bottom w:w="60" w:type="dxa"/>
+              <w:right w:w="100" w:type="dxa"/>
+            </w:tcMar>
+          </w:tcPr>
+          <w:p>
+            <w:r>
+              <w:t xml:space="preserve">USD 0.088 per GB-month</w:t>
+            </w:r>
+          </w:p>
+        </w:tc>
+        <w:tc>
+          <w:tcPr>
+            <w:tcW w:w="2600" w:type="dxa"/>
+            <w:tcBorders>
+              <w:top w:val="single" w:sz="4" w:space="0" w:color="BFBFBF"/>
+              <w:left w:val="single" w:sz="4" w:space="0" w:color="BFBFBF"/>
+              <w:bottom w:val="single" w:sz="4" w:space="0" w:color="BFBFBF"/>
+              <w:right w:val="single" w:sz="4" w:space="0" w:color="BFBFBF"/>
+            </w:tcBorders>
+            <w:tcMar>
+              <w:top w:w="60" w:type="dxa"/>
+              <w:left w:w="100" w:type="dxa"/>
+              <w:bottom w:w="60" w:type="dxa"/>
+              <w:right w:w="100" w:type="dxa"/>
+            </w:tcMar>
+          </w:tcPr>
+          <w:p>
+            <w:r>
+              <w:t xml:space="preserve">USD 2.82</w:t>
+            </w:r>
+          </w:p>
+        </w:tc>
+      </w:tr>
+      <w:tr>
+        <w:tblPrEx>
+          <w:tblCellMar>
+            <w:top w:w="0" w:type="dxa"/>
+            <w:bottom w:w="0" w:type="dxa"/>
+          </w:tblCellMar>
+        </w:tblPrEx>
+        <w:trPr>
+          <w:cantSplit/>
+        </w:trPr>
+        <w:tc>
+          <w:tcPr>
+            <w:tcW w:w="3600" w:type="dxa"/>
+            <w:tcBorders>
+              <w:top w:val="single" w:sz="4" w:space="0" w:color="BFBFBF"/>
+              <w:left w:val="single" w:sz="4" w:space="0" w:color="BFBFBF"/>
+              <w:bottom w:val="single" w:sz="4" w:space="0" w:color="BFBFBF"/>
+              <w:right w:val="single" w:sz="4" w:space="0" w:color="BFBFBF"/>
+            </w:tcBorders>
+            <w:tcMar>
+              <w:top w:w="60" w:type="dxa"/>
+              <w:left w:w="100" w:type="dxa"/>
+              <w:bottom w:w="60" w:type="dxa"/>
+              <w:right w:w="100" w:type="dxa"/>
+            </w:tcMar>
+          </w:tcPr>
+          <w:p>
+            <w:r>
+              <w:rPr>
+                <w:b/>
+                <w:bCs/>
+              </w:rPr>
+              <w:t xml:space="preserve">Total</w:t>
+            </w:r>
+          </w:p>
+        </w:tc>
+        <w:tc>
+          <w:tcPr>
+            <w:tcW w:w="3880" w:type="dxa"/>
+            <w:tcBorders>
+              <w:top w:val="single" w:sz="4" w:space="0" w:color="BFBFBF"/>
+              <w:left w:val="single" w:sz="4" w:space="0" w:color="BFBFBF"/>
+              <w:bottom w:val="single" w:sz="4" w:space="0" w:color="BFBFBF"/>
+              <w:right w:val="single" w:sz="4" w:space="0" w:color="BFBFBF"/>
+            </w:tcBorders>
+            <w:tcMar>
+              <w:top w:w="60" w:type="dxa"/>
+              <w:left w:w="100" w:type="dxa"/>
+              <w:bottom w:w="60" w:type="dxa"/>
+              <w:right w:w="100" w:type="dxa"/>
+            </w:tcMar>
+          </w:tcPr>
+          <w:p>
+            <w:r>
+              <w:t xml:space="preserve">about USD 0.22 per hour</w:t>
+            </w:r>
+          </w:p>
+        </w:tc>
+        <w:tc>
+          <w:tcPr>
+            <w:tcW w:w="2600" w:type="dxa"/>
+            <w:tcBorders>
+              <w:top w:val="single" w:sz="4" w:space="0" w:color="BFBFBF"/>
+              <w:left w:val="single" w:sz="4" w:space="0" w:color="BFBFBF"/>
+              <w:bottom w:val="single" w:sz="4" w:space="0" w:color="BFBFBF"/>
+              <w:right w:val="single" w:sz="4" w:space="0" w:color="BFBFBF"/>
+            </w:tcBorders>
+            <w:tcMar>
+              <w:top w:w="60" w:type="dxa"/>
+              <w:left w:w="100" w:type="dxa"/>
+              <w:bottom w:w="60" w:type="dxa"/>
+              <w:right w:w="100" w:type="dxa"/>
+            </w:tcMar>
+          </w:tcPr>
+          <w:p>
+            <w:r>
+              <w:rPr>
+                <w:b/>
+                <w:bCs/>
+              </w:rPr>
+              <w:t xml:space="preserve">about USD 158 + usage</w:t>
             </w:r>
           </w:p>
         </w:tc>
@@ -2318,6 +2742,14 @@
       <w:pPr>
         <w:spacing w:after="120"/>
       </w:pPr>
+    </w:p>
+    <w:p>
+      <w:pPr>
+        <w:spacing w:after="200"/>
+      </w:pPr>
+      <w:r>
+        <w:t xml:space="preserve">Traffic-based charges (load balancer capacity units, NAT data processing and data transfer out) are small at lab traffic levels. The Free Tier's 750 server-hours a month would cover about one of the four servers. The servers use standard CPU credit mode, so they can never bill above their hourly rate.</w:t>
+      </w:r>
     </w:p>
     <w:p>
       <w:pPr>
@@ -2364,7 +2796,7 @@
         <w:t xml:space="preserve">One zonal NAT gateway per zone</w:t>
       </w:r>
       <w:r>
-        <w:t xml:space="preserve"> gives the same resilience at the same cost, but needs a NAT gateway in each public subnet, a separate private route table per zone, and manual changes whenever Onward adds a zone. Rejected because the regional gateway does the same job with fewer parts.</w:t>
+        <w:t xml:space="preserve"> gives the same resilience at the same price, but needs a NAT gateway in each public subnet, a separate private route table per zone, and manual changes whenever Onward adds a zone. Rejected because the regional gateway does the same job with fewer parts.</w:t>
       </w:r>
     </w:p>
     <w:p>
@@ -2384,7 +2816,7 @@
         <w:t xml:space="preserve">VPC interface endpoints for Systems Manager</w:t>
       </w:r>
       <w:r>
-        <w:t xml:space="preserve"> cost about USD 0.011 per hour per endpoint per zone. Session Manager needs three, which is about USD 16 a month for two zones. They would not remove the NAT gateway, because servers still need to download packages from the internet. Rejected as an extra cost for now, but they are the right next step if Onward later wants internal servers with no internet path at all.</w:t>
+        <w:t xml:space="preserve"> cost USD 0.011 per hour per endpoint per zone. Session Manager needs three, which is about USD 16 a month for two zones. They would not remove the NAT gateway, because servers still need to download packages from the internet. Rejected as an extra cost for now, but they are the right next step if Onward later wants internal servers with no internet path at all.</w:t>
       </w:r>
     </w:p>
     <w:p>
@@ -2401,6 +2833,46 @@
           <w:b/>
           <w:bCs/>
         </w:rPr>
+        <w:t xml:space="preserve">One load balancer with a second listener for the order services</w:t>
+      </w:r>
+      <w:r>
+        <w:t xml:space="preserve"> would save about USD 18 a month, but would put the order services on a public endpoint and send internal calls out through the NAT gateway. Rejected for security.</w:t>
+      </w:r>
+    </w:p>
+    <w:p>
+      <w:pPr>
+        <w:pStyle w:val="ListParagraph"/>
+        <w:numPr>
+          <w:ilvl w:val="0"/>
+          <w:numId w:val="2"/>
+        </w:numPr>
+        <w:spacing w:after="80"/>
+      </w:pPr>
+      <w:r>
+        <w:rPr>
+          <w:b/>
+          <w:bCs/>
+        </w:rPr>
+        <w:t xml:space="preserve">Fixed order servers without an internal load balancer</w:t>
+      </w:r>
+      <w:r>
+        <w:t xml:space="preserve"> would save about USD 18 a month, but nothing would replace a failed server, and the web tier would have to handle failover itself. Rejected because the brief requires high availability.</w:t>
+      </w:r>
+    </w:p>
+    <w:p>
+      <w:pPr>
+        <w:pStyle w:val="ListParagraph"/>
+        <w:numPr>
+          <w:ilvl w:val="0"/>
+          <w:numId w:val="2"/>
+        </w:numPr>
+        <w:spacing w:after="80"/>
+      </w:pPr>
+      <w:r>
+        <w:rPr>
+          <w:b/>
+          <w:bCs/>
+        </w:rPr>
         <w:t xml:space="preserve">A bastion host</w:t>
       </w:r>
       <w:r>
@@ -2409,10 +2881,30 @@
     </w:p>
     <w:p>
       <w:pPr>
+        <w:pStyle w:val="ListParagraph"/>
+        <w:numPr>
+          <w:ilvl w:val="0"/>
+          <w:numId w:val="2"/>
+        </w:numPr>
+        <w:spacing w:after="80"/>
+      </w:pPr>
+      <w:r>
+        <w:rPr>
+          <w:b/>
+          <w:bCs/>
+        </w:rPr>
+        <w:t xml:space="preserve">A custom server image (baked AMI)</w:t>
+      </w:r>
+      <w:r>
+        <w:t xml:space="preserve"> would start servers faster, but it needs a separate image-building pipeline and must be rebuilt for every patch. Rejected for now. It becomes worthwhile when scale-out speed on sales days matters.</w:t>
+      </w:r>
+    </w:p>
+    <w:p>
+      <w:pPr>
         <w:spacing w:after="200"/>
       </w:pPr>
       <w:r>
-        <w:t xml:space="preserve">For the lab, the stack is deleted after grading, so the real cost is a few dollars for the days it runs.</w:t>
+        <w:t xml:space="preserve">For the lab, the stack is deleted after grading, so the real cost is about USD 5 for each day it runs.</w:t>
       </w:r>
     </w:p>
     <w:p>
@@ -2592,7 +3084,7 @@
           </w:tcPr>
           <w:p>
             <w:r>
-              <w:t xml:space="preserve">Merchants and customers can reach the front end even if one data center has a problem.</w:t>
+              <w:t xml:space="preserve">Merchants and customers can reach the front end, and orders keep flowing, even if one data center has a problem.</w:t>
             </w:r>
           </w:p>
         </w:tc>
@@ -2614,7 +3106,7 @@
           </w:tcPr>
           <w:p>
             <w:r>
-              <w:t xml:space="preserve">Stop the web server in one zone: the load balancer address keeps returning the page, and Auto Scaling launches a replacement.</w:t>
+              <w:t xml:space="preserve">With a request loop running against the load balancer address, terminate the web server in one zone: the page keeps loading from the other zone, and Auto Scaling launches a replacement. Repeat for the order tier.</w:t>
             </w:r>
           </w:p>
         </w:tc>
@@ -2691,7 +3183,7 @@
           </w:tcPr>
           <w:p>
             <w:r>
-              <w:t xml:space="preserve">Internal servers have no public IP, and a connection attempt from the internet times out. No security group allows port 22. Session history shows which engineer connected and when.</w:t>
+              <w:t xml:space="preserve">No server has a public IP. The internal load balancer resolves only to private addresses. No security group allows port 22, and no server has a key pair. Session history shows which engineer connected and when.</w:t>
             </w:r>
           </w:p>
         </w:tc>
@@ -2768,7 +3260,7 @@
           </w:tcPr>
           <w:p>
             <w:r>
-              <w:t xml:space="preserve">An engineer opens a Session Manager session on an internal server and installs a package with dnf successfully.</w:t>
+              <w:t xml:space="preserve">An engineer opens a Session Manager session on an order server and installs a package with dnf successfully.</w:t>
             </w:r>
           </w:p>
         </w:tc>
@@ -2979,10 +3471,10 @@
           <w:b/>
           <w:bCs/>
         </w:rPr>
-        <w:t xml:space="preserve">Fixed capacity.</w:t>
-      </w:r>
-      <w:r>
-        <w:t xml:space="preserve"> The front end runs at a minimum of two servers. Scaling policies for sales days are a later step.</w:t>
+        <w:t xml:space="preserve">Slower start-up.</w:t>
+      </w:r>
+      <w:r>
+        <w:t xml:space="preserve"> Installing software at boot adds about a minute before a new server takes traffic. A custom image would remove that if sales-day scale-out speed becomes important.</w:t>
       </w:r>
     </w:p>
     <w:p>
@@ -2999,10 +3491,30 @@
           <w:b/>
           <w:bCs/>
         </w:rPr>
+        <w:t xml:space="preserve">Fixed capacity.</w:t>
+      </w:r>
+      <w:r>
+        <w:t xml:space="preserve"> Each tier runs at two servers. Scaling policies for sales days are a later step.</w:t>
+      </w:r>
+    </w:p>
+    <w:p>
+      <w:pPr>
+        <w:pStyle w:val="ListParagraph"/>
+        <w:numPr>
+          <w:ilvl w:val="0"/>
+          <w:numId w:val="2"/>
+        </w:numPr>
+        <w:spacing w:after="80"/>
+      </w:pPr>
+      <w:r>
+        <w:rPr>
+          <w:b/>
+          <w:bCs/>
+        </w:rPr>
         <w:t xml:space="preserve">Prices change.</w:t>
       </w:r>
       <w:r>
-        <w:t xml:space="preserve"> The figures above are on-demand list prices at the time of writing and exclude data transfer beyond the NAT processing charge.</w:t>
+        <w:t xml:space="preserve"> The figures above are on-demand list prices from the AWS Price List at the time of writing.</w:t>
       </w:r>
     </w:p>
     <w:sectPr>

</xml_diff>